<commit_message>
docs(manual): add 41 features missing from the user manual
Full app-screen review found 41 routes present in the live system but absent from
USER_MANUAL.md. Appended a role-grouped addendum in the manual's plain-language
voice (CPOE order entry, RPM, Patient Avatar, Billing Suite, System Admin Suite,
Clinical Quality, MCP Management, EMS Coordinated Response, Team Wellness Report,
law-enforcement program, and more). Source markdown otherwise untouched.
Regenerated USER_MANUAL .docx/.pdf.

Co-Authored-By: Claude Opus 4.8 (1M context) <noreply@anthropic.com>
</commit_message>
<xml_diff>
--- a/docs/manual/USER_MANUAL.docx
+++ b/docs/manual/USER_MANUAL.docx
@@ -11713,6 +11713,1959 @@
           <w:i/>
         </w:rPr>
         <w:t xml:space="preserve">Copyright (c) 2025-2026 Envision Virtual Edge Group LLC. All rights reserved.</w:t>
+      </w:r>
+    </w:p>
+    <w:p>
+      <w:r>
+        <w:pict>
+          <v:rect style="width:0;height:1.5pt" o:hralign="center" o:hrstd="t" o:hr="t"/>
+        </w:pict>
+      </w:r>
+    </w:p>
+    <w:p>
+      <w:pPr>
+        <w:pStyle w:val="Heading2"/>
+      </w:pPr>
+      <w:bookmarkStart w:id="119" w:name="X0af69fd0e915a041734633e945f239df546685e"/>
+      <w:r>
+        <w:t xml:space="preserve">Addendum – Additional Features (verified 2026-06-11)</w:t>
+      </w:r>
+      <w:bookmarkEnd w:id="119"/>
+    </w:p>
+    <w:p>
+      <w:pPr>
+        <w:pStyle w:val="FirstParagraph"/>
+      </w:pPr>
+      <w:r>
+        <w:t xml:space="preserve">These features are part of the live system but were not in the earlier version of this manual. A full review of every screen in the app on 2026-06-11 found them. They are grouped by who uses them.</w:t>
+      </w:r>
+    </w:p>
+    <w:p>
+      <w:pPr>
+        <w:pStyle w:val="Heading3"/>
+      </w:pPr>
+      <w:bookmarkStart w:id="120" w:name="for-patients-and-seniors-wellfit-1"/>
+      <w:r>
+        <w:t xml:space="preserve">For Patients and Seniors (WellFit)</w:t>
+      </w:r>
+      <w:bookmarkEnd w:id="120"/>
+    </w:p>
+    <w:p>
+      <w:pPr>
+        <w:pStyle w:val="Heading4"/>
+      </w:pPr>
+      <w:bookmarkStart w:id="121" w:name="medication-management-1"/>
+      <w:r>
+        <w:t xml:space="preserve">Medication Management</w:t>
+      </w:r>
+      <w:bookmarkEnd w:id="121"/>
+    </w:p>
+    <w:p>
+      <w:pPr>
+        <w:pStyle w:val="FirstParagraph"/>
+      </w:pPr>
+      <w:r>
+        <w:rPr>
+          <w:b/>
+        </w:rPr>
+        <w:t xml:space="preserve">What it does:</w:t>
+      </w:r>
+      <w:r>
+        <w:t xml:space="preserve"> </w:t>
+      </w:r>
+      <w:r>
+        <w:t xml:space="preserve">A fuller view of your medicines than the Medicine Cabinet – track doses, schedules, and refills.</w:t>
+      </w:r>
+      <w:r>
+        <w:t xml:space="preserve"> </w:t>
+      </w:r>
+      <w:r>
+        <w:rPr>
+          <w:b/>
+        </w:rPr>
+        <w:t xml:space="preserve">How to get there:</w:t>
+      </w:r>
+      <w:r>
+        <w:t xml:space="preserve"> </w:t>
+      </w:r>
+      <w:r>
+        <w:t xml:space="preserve">Go to</w:t>
+      </w:r>
+      <w:r>
+        <w:t xml:space="preserve"> </w:t>
+      </w:r>
+      <w:r>
+        <w:rPr>
+          <w:rStyle w:val="VerbatimChar"/>
+        </w:rPr>
+        <w:t xml:space="preserve">/medication-management</w:t>
+      </w:r>
+    </w:p>
+    <w:p>
+      <w:pPr>
+        <w:pStyle w:val="Heading4"/>
+      </w:pPr>
+      <w:bookmarkStart w:id="122" w:name="vital-capture"/>
+      <w:r>
+        <w:t xml:space="preserve">Vital Capture</w:t>
+      </w:r>
+      <w:bookmarkEnd w:id="122"/>
+    </w:p>
+    <w:p>
+      <w:pPr>
+        <w:pStyle w:val="FirstParagraph"/>
+      </w:pPr>
+      <w:r>
+        <w:rPr>
+          <w:b/>
+        </w:rPr>
+        <w:t xml:space="preserve">What it does:</w:t>
+      </w:r>
+      <w:r>
+        <w:t xml:space="preserve"> </w:t>
+      </w:r>
+      <w:r>
+        <w:t xml:space="preserve">Manually enter your vital signs (blood pressure, heart rate, oxygen, weight) any time, not just during a check-in.</w:t>
+      </w:r>
+      <w:r>
+        <w:t xml:space="preserve"> </w:t>
+      </w:r>
+      <w:r>
+        <w:rPr>
+          <w:b/>
+        </w:rPr>
+        <w:t xml:space="preserve">How to get there:</w:t>
+      </w:r>
+      <w:r>
+        <w:t xml:space="preserve"> </w:t>
+      </w:r>
+      <w:r>
+        <w:t xml:space="preserve">Go to</w:t>
+      </w:r>
+      <w:r>
+        <w:t xml:space="preserve"> </w:t>
+      </w:r>
+      <w:r>
+        <w:rPr>
+          <w:rStyle w:val="VerbatimChar"/>
+        </w:rPr>
+        <w:t xml:space="preserve">/vital-capture</w:t>
+      </w:r>
+    </w:p>
+    <w:p>
+      <w:pPr>
+        <w:pStyle w:val="Heading4"/>
+      </w:pPr>
+      <w:bookmarkStart w:id="123" w:name="questions"/>
+      <w:r>
+        <w:t xml:space="preserve">Questions</w:t>
+      </w:r>
+      <w:bookmarkEnd w:id="123"/>
+    </w:p>
+    <w:p>
+      <w:pPr>
+        <w:pStyle w:val="FirstParagraph"/>
+      </w:pPr>
+      <w:r>
+        <w:rPr>
+          <w:b/>
+        </w:rPr>
+        <w:t xml:space="preserve">What it does:</w:t>
+      </w:r>
+      <w:r>
+        <w:t xml:space="preserve"> </w:t>
+      </w:r>
+      <w:r>
+        <w:t xml:space="preserve">Send a health question and browse questions you have asked before.</w:t>
+      </w:r>
+      <w:r>
+        <w:t xml:space="preserve"> </w:t>
+      </w:r>
+      <w:r>
+        <w:rPr>
+          <w:b/>
+        </w:rPr>
+        <w:t xml:space="preserve">How to get there:</w:t>
+      </w:r>
+      <w:r>
+        <w:t xml:space="preserve"> </w:t>
+      </w:r>
+      <w:r>
+        <w:t xml:space="preserve">Go to</w:t>
+      </w:r>
+      <w:r>
+        <w:t xml:space="preserve"> </w:t>
+      </w:r>
+      <w:r>
+        <w:rPr>
+          <w:rStyle w:val="VerbatimChar"/>
+        </w:rPr>
+        <w:t xml:space="preserve">/questions</w:t>
+      </w:r>
+    </w:p>
+    <w:p>
+      <w:pPr>
+        <w:pStyle w:val="Heading4"/>
+      </w:pPr>
+      <w:bookmarkStart w:id="124" w:name="check-in-history"/>
+      <w:r>
+        <w:t xml:space="preserve">Check-In History</w:t>
+      </w:r>
+      <w:bookmarkEnd w:id="124"/>
+    </w:p>
+    <w:p>
+      <w:pPr>
+        <w:pStyle w:val="FirstParagraph"/>
+      </w:pPr>
+      <w:r>
+        <w:rPr>
+          <w:b/>
+        </w:rPr>
+        <w:t xml:space="preserve">What it does:</w:t>
+      </w:r>
+      <w:r>
+        <w:t xml:space="preserve"> </w:t>
+      </w:r>
+      <w:r>
+        <w:t xml:space="preserve">Look back at your past daily check-ins and see how your health and mood have changed over time.</w:t>
+      </w:r>
+      <w:r>
+        <w:t xml:space="preserve"> </w:t>
+      </w:r>
+      <w:r>
+        <w:rPr>
+          <w:b/>
+        </w:rPr>
+        <w:t xml:space="preserve">How to get there:</w:t>
+      </w:r>
+      <w:r>
+        <w:t xml:space="preserve"> </w:t>
+      </w:r>
+      <w:r>
+        <w:t xml:space="preserve">Go to</w:t>
+      </w:r>
+      <w:r>
+        <w:t xml:space="preserve"> </w:t>
+      </w:r>
+      <w:r>
+        <w:rPr>
+          <w:rStyle w:val="VerbatimChar"/>
+        </w:rPr>
+        <w:t xml:space="preserve">/check-in-history</w:t>
+      </w:r>
+    </w:p>
+    <w:p>
+      <w:pPr>
+        <w:pStyle w:val="Heading4"/>
+      </w:pPr>
+      <w:bookmarkStart w:id="125" w:name="meal-details"/>
+      <w:r>
+        <w:t xml:space="preserve">Meal Details</w:t>
+      </w:r>
+      <w:bookmarkEnd w:id="125"/>
+    </w:p>
+    <w:p>
+      <w:pPr>
+        <w:pStyle w:val="FirstParagraph"/>
+      </w:pPr>
+      <w:r>
+        <w:rPr>
+          <w:b/>
+        </w:rPr>
+        <w:t xml:space="preserve">What it does:</w:t>
+      </w:r>
+      <w:r>
+        <w:t xml:space="preserve"> </w:t>
+      </w:r>
+      <w:r>
+        <w:t xml:space="preserve">Open a meal suggestion to see the full recipe, ingredients, and nutrition information.</w:t>
+      </w:r>
+      <w:r>
+        <w:t xml:space="preserve"> </w:t>
+      </w:r>
+      <w:r>
+        <w:rPr>
+          <w:b/>
+        </w:rPr>
+        <w:t xml:space="preserve">How to get there:</w:t>
+      </w:r>
+      <w:r>
+        <w:t xml:space="preserve"> </w:t>
+      </w:r>
+      <w:r>
+        <w:t xml:space="preserve">Tap a meal on your home screen, or go to</w:t>
+      </w:r>
+      <w:r>
+        <w:t xml:space="preserve"> </w:t>
+      </w:r>
+      <w:r>
+        <w:rPr>
+          <w:rStyle w:val="VerbatimChar"/>
+        </w:rPr>
+        <w:t xml:space="preserve">/meals/&lt;meal id&gt;</w:t>
+      </w:r>
+    </w:p>
+    <w:p>
+      <w:pPr>
+        <w:pStyle w:val="Heading4"/>
+      </w:pPr>
+      <w:bookmarkStart w:id="126" w:name="photo-and-privacy-consent"/>
+      <w:r>
+        <w:t xml:space="preserve">Photo and Privacy Consent</w:t>
+      </w:r>
+      <w:bookmarkEnd w:id="126"/>
+    </w:p>
+    <w:p>
+      <w:pPr>
+        <w:pStyle w:val="FirstParagraph"/>
+      </w:pPr>
+      <w:r>
+        <w:rPr>
+          <w:b/>
+        </w:rPr>
+        <w:t xml:space="preserve">What it does:</w:t>
+      </w:r>
+      <w:r>
+        <w:t xml:space="preserve"> </w:t>
+      </w:r>
+      <w:r>
+        <w:t xml:space="preserve">Choose whether your photo can be shown in community features, and adjust your privacy preferences at any time.</w:t>
+      </w:r>
+      <w:r>
+        <w:t xml:space="preserve"> </w:t>
+      </w:r>
+      <w:r>
+        <w:rPr>
+          <w:b/>
+        </w:rPr>
+        <w:t xml:space="preserve">How to get there:</w:t>
+      </w:r>
+      <w:r>
+        <w:t xml:space="preserve"> </w:t>
+      </w:r>
+      <w:r>
+        <w:t xml:space="preserve">Go to</w:t>
+      </w:r>
+      <w:r>
+        <w:t xml:space="preserve"> </w:t>
+      </w:r>
+      <w:r>
+        <w:rPr>
+          <w:rStyle w:val="VerbatimChar"/>
+        </w:rPr>
+        <w:t xml:space="preserve">/consent-photo</w:t>
+      </w:r>
+      <w:r>
+        <w:t xml:space="preserve"> </w:t>
+      </w:r>
+      <w:r>
+        <w:t xml:space="preserve">(photos) or</w:t>
+      </w:r>
+      <w:r>
+        <w:t xml:space="preserve"> </w:t>
+      </w:r>
+      <w:r>
+        <w:rPr>
+          <w:rStyle w:val="VerbatimChar"/>
+        </w:rPr>
+        <w:t xml:space="preserve">/consent-privacy</w:t>
+      </w:r>
+      <w:r>
+        <w:t xml:space="preserve"> </w:t>
+      </w:r>
+      <w:r>
+        <w:t xml:space="preserve">(privacy)</w:t>
+      </w:r>
+    </w:p>
+    <w:p>
+      <w:pPr>
+        <w:pStyle w:val="Heading4"/>
+      </w:pPr>
+      <w:bookmarkStart w:id="127" w:name="smart-callback"/>
+      <w:r>
+        <w:t xml:space="preserve">Smart Callback</w:t>
+      </w:r>
+      <w:bookmarkEnd w:id="127"/>
+    </w:p>
+    <w:p>
+      <w:pPr>
+        <w:pStyle w:val="FirstParagraph"/>
+      </w:pPr>
+      <w:r>
+        <w:rPr>
+          <w:b/>
+        </w:rPr>
+        <w:t xml:space="preserve">What it does:</w:t>
+      </w:r>
+      <w:r>
+        <w:t xml:space="preserve"> </w:t>
+      </w:r>
+      <w:r>
+        <w:t xml:space="preserve">Ask a provider to call you back, instead of waiting on hold.</w:t>
+      </w:r>
+      <w:r>
+        <w:t xml:space="preserve"> </w:t>
+      </w:r>
+      <w:r>
+        <w:rPr>
+          <w:b/>
+        </w:rPr>
+        <w:t xml:space="preserve">How to get there:</w:t>
+      </w:r>
+      <w:r>
+        <w:t xml:space="preserve"> </w:t>
+      </w:r>
+      <w:r>
+        <w:t xml:space="preserve">Go to</w:t>
+      </w:r>
+      <w:r>
+        <w:t xml:space="preserve"> </w:t>
+      </w:r>
+      <w:r>
+        <w:rPr>
+          <w:rStyle w:val="VerbatimChar"/>
+        </w:rPr>
+        <w:t xml:space="preserve">/smart-callback</w:t>
+      </w:r>
+    </w:p>
+    <w:p>
+      <w:pPr>
+        <w:pStyle w:val="Heading3"/>
+      </w:pPr>
+      <w:bookmarkStart w:id="128" w:name="X640ee50b6fc6ff93efa7b3b8b3248c3063a4c92"/>
+      <w:r>
+        <w:t xml:space="preserve">For Nurses and Doctors – Placing Orders (CPOE)</w:t>
+      </w:r>
+      <w:bookmarkEnd w:id="128"/>
+    </w:p>
+    <w:p>
+      <w:pPr>
+        <w:pStyle w:val="FirstParagraph"/>
+      </w:pPr>
+      <w:r>
+        <w:t xml:space="preserve">These screens let clinical staff place orders directly in the system. They meet federal ONC certification requirements.</w:t>
+      </w:r>
+    </w:p>
+    <w:p>
+      <w:pPr>
+        <w:pStyle w:val="Heading4"/>
+      </w:pPr>
+      <w:bookmarkStart w:id="129" w:name="medication-orders"/>
+      <w:r>
+        <w:t xml:space="preserve">Medication Orders</w:t>
+      </w:r>
+      <w:bookmarkEnd w:id="129"/>
+    </w:p>
+    <w:p>
+      <w:pPr>
+        <w:pStyle w:val="FirstParagraph"/>
+      </w:pPr>
+      <w:r>
+        <w:rPr>
+          <w:b/>
+        </w:rPr>
+        <w:t xml:space="preserve">What it does:</w:t>
+      </w:r>
+      <w:r>
+        <w:t xml:space="preserve"> </w:t>
+      </w:r>
+      <w:r>
+        <w:t xml:space="preserve">Order medications for a patient.</w:t>
+      </w:r>
+      <w:r>
+        <w:t xml:space="preserve"> </w:t>
+      </w:r>
+      <w:r>
+        <w:rPr>
+          <w:b/>
+        </w:rPr>
+        <w:t xml:space="preserve">How to get there:</w:t>
+      </w:r>
+      <w:r>
+        <w:t xml:space="preserve"> </w:t>
+      </w:r>
+      <w:r>
+        <w:rPr>
+          <w:rStyle w:val="VerbatimChar"/>
+        </w:rPr>
+        <w:t xml:space="preserve">/admin/cpoe/medication/&lt;patient id&gt;</w:t>
+      </w:r>
+    </w:p>
+    <w:p>
+      <w:pPr>
+        <w:pStyle w:val="Heading4"/>
+      </w:pPr>
+      <w:bookmarkStart w:id="130" w:name="lab-orders"/>
+      <w:r>
+        <w:t xml:space="preserve">Lab Orders</w:t>
+      </w:r>
+      <w:bookmarkEnd w:id="130"/>
+    </w:p>
+    <w:p>
+      <w:pPr>
+        <w:pStyle w:val="FirstParagraph"/>
+      </w:pPr>
+      <w:r>
+        <w:rPr>
+          <w:b/>
+        </w:rPr>
+        <w:t xml:space="preserve">What it does:</w:t>
+      </w:r>
+      <w:r>
+        <w:t xml:space="preserve"> </w:t>
+      </w:r>
+      <w:r>
+        <w:t xml:space="preserve">Order lab tests for a patient.</w:t>
+      </w:r>
+      <w:r>
+        <w:t xml:space="preserve"> </w:t>
+      </w:r>
+      <w:r>
+        <w:rPr>
+          <w:b/>
+        </w:rPr>
+        <w:t xml:space="preserve">How to get there:</w:t>
+      </w:r>
+      <w:r>
+        <w:t xml:space="preserve"> </w:t>
+      </w:r>
+      <w:r>
+        <w:rPr>
+          <w:rStyle w:val="VerbatimChar"/>
+        </w:rPr>
+        <w:t xml:space="preserve">/admin/cpoe/lab/&lt;patient id&gt;</w:t>
+      </w:r>
+    </w:p>
+    <w:p>
+      <w:pPr>
+        <w:pStyle w:val="Heading4"/>
+      </w:pPr>
+      <w:bookmarkStart w:id="131" w:name="imaging-orders"/>
+      <w:r>
+        <w:t xml:space="preserve">Imaging Orders</w:t>
+      </w:r>
+      <w:bookmarkEnd w:id="131"/>
+    </w:p>
+    <w:p>
+      <w:pPr>
+        <w:pStyle w:val="FirstParagraph"/>
+      </w:pPr>
+      <w:r>
+        <w:rPr>
+          <w:b/>
+        </w:rPr>
+        <w:t xml:space="preserve">What it does:</w:t>
+      </w:r>
+      <w:r>
+        <w:t xml:space="preserve"> </w:t>
+      </w:r>
+      <w:r>
+        <w:t xml:space="preserve">Order imaging (X-ray, CT, etc.) for a patient.</w:t>
+      </w:r>
+      <w:r>
+        <w:t xml:space="preserve"> </w:t>
+      </w:r>
+      <w:r>
+        <w:rPr>
+          <w:b/>
+        </w:rPr>
+        <w:t xml:space="preserve">How to get there:</w:t>
+      </w:r>
+      <w:r>
+        <w:t xml:space="preserve"> </w:t>
+      </w:r>
+      <w:r>
+        <w:rPr>
+          <w:rStyle w:val="VerbatimChar"/>
+        </w:rPr>
+        <w:t xml:space="preserve">/admin/cpoe/imaging/&lt;patient id&gt;</w:t>
+      </w:r>
+    </w:p>
+    <w:p>
+      <w:pPr>
+        <w:pStyle w:val="Heading4"/>
+      </w:pPr>
+      <w:bookmarkStart w:id="132" w:name="implantable-devices"/>
+      <w:r>
+        <w:t xml:space="preserve">Implantable Devices</w:t>
+      </w:r>
+      <w:bookmarkEnd w:id="132"/>
+    </w:p>
+    <w:p>
+      <w:pPr>
+        <w:pStyle w:val="FirstParagraph"/>
+      </w:pPr>
+      <w:r>
+        <w:rPr>
+          <w:b/>
+        </w:rPr>
+        <w:t xml:space="preserve">What it does:</w:t>
+      </w:r>
+      <w:r>
+        <w:t xml:space="preserve"> </w:t>
+      </w:r>
+      <w:r>
+        <w:t xml:space="preserve">Record and review a patient’s implantable devices (pacemakers, etc.).</w:t>
+      </w:r>
+      <w:r>
+        <w:t xml:space="preserve"> </w:t>
+      </w:r>
+      <w:r>
+        <w:rPr>
+          <w:b/>
+        </w:rPr>
+        <w:t xml:space="preserve">How to get there:</w:t>
+      </w:r>
+      <w:r>
+        <w:t xml:space="preserve"> </w:t>
+      </w:r>
+      <w:r>
+        <w:rPr>
+          <w:rStyle w:val="VerbatimChar"/>
+        </w:rPr>
+        <w:t xml:space="preserve">/admin/devices/&lt;patient id&gt;</w:t>
+      </w:r>
+    </w:p>
+    <w:p>
+      <w:pPr>
+        <w:pStyle w:val="Heading4"/>
+      </w:pPr>
+      <w:bookmarkStart w:id="133" w:name="family-health-history"/>
+      <w:r>
+        <w:t xml:space="preserve">Family Health History</w:t>
+      </w:r>
+      <w:bookmarkEnd w:id="133"/>
+    </w:p>
+    <w:p>
+      <w:pPr>
+        <w:pStyle w:val="FirstParagraph"/>
+      </w:pPr>
+      <w:r>
+        <w:rPr>
+          <w:b/>
+        </w:rPr>
+        <w:t xml:space="preserve">What it does:</w:t>
+      </w:r>
+      <w:r>
+        <w:t xml:space="preserve"> </w:t>
+      </w:r>
+      <w:r>
+        <w:t xml:space="preserve">Document a patient’s family medical history.</w:t>
+      </w:r>
+      <w:r>
+        <w:t xml:space="preserve"> </w:t>
+      </w:r>
+      <w:r>
+        <w:rPr>
+          <w:b/>
+        </w:rPr>
+        <w:t xml:space="preserve">How to get there:</w:t>
+      </w:r>
+      <w:r>
+        <w:t xml:space="preserve"> </w:t>
+      </w:r>
+      <w:r>
+        <w:rPr>
+          <w:rStyle w:val="VerbatimChar"/>
+        </w:rPr>
+        <w:t xml:space="preserve">/admin/family-history/&lt;patient id&gt;</w:t>
+      </w:r>
+    </w:p>
+    <w:p>
+      <w:pPr>
+        <w:pStyle w:val="Heading3"/>
+      </w:pPr>
+      <w:bookmarkStart w:id="134" w:name="for-nurses-1"/>
+      <w:r>
+        <w:t xml:space="preserve">For Nurses</w:t>
+      </w:r>
+      <w:bookmarkEnd w:id="134"/>
+    </w:p>
+    <w:p>
+      <w:pPr>
+        <w:pStyle w:val="Heading4"/>
+      </w:pPr>
+      <w:bookmarkStart w:id="135" w:name="nurse-wellness-resilience-hub"/>
+      <w:r>
+        <w:t xml:space="preserve">Nurse Wellness (Resilience Hub)</w:t>
+      </w:r>
+      <w:bookmarkEnd w:id="135"/>
+    </w:p>
+    <w:p>
+      <w:pPr>
+        <w:pStyle w:val="FirstParagraph"/>
+      </w:pPr>
+      <w:r>
+        <w:rPr>
+          <w:b/>
+        </w:rPr>
+        <w:t xml:space="preserve">What it does:</w:t>
+      </w:r>
+      <w:r>
+        <w:t xml:space="preserve"> </w:t>
+      </w:r>
+      <w:r>
+        <w:t xml:space="preserve">Tools to help with burnout and emotional resilience for nursing staff.</w:t>
+      </w:r>
+      <w:r>
+        <w:t xml:space="preserve"> </w:t>
+      </w:r>
+      <w:r>
+        <w:rPr>
+          <w:b/>
+        </w:rPr>
+        <w:t xml:space="preserve">How to get there:</w:t>
+      </w:r>
+      <w:r>
+        <w:t xml:space="preserve"> </w:t>
+      </w:r>
+      <w:r>
+        <w:t xml:space="preserve">Go to</w:t>
+      </w:r>
+      <w:r>
+        <w:t xml:space="preserve"> </w:t>
+      </w:r>
+      <w:r>
+        <w:rPr>
+          <w:rStyle w:val="VerbatimChar"/>
+        </w:rPr>
+        <w:t xml:space="preserve">/nurse-wellness</w:t>
+      </w:r>
+    </w:p>
+    <w:p>
+      <w:pPr>
+        <w:pStyle w:val="Heading4"/>
+      </w:pPr>
+      <w:bookmarkStart w:id="136" w:name="team-wellness-report"/>
+      <w:r>
+        <w:t xml:space="preserve">Team Wellness Report</w:t>
+      </w:r>
+      <w:bookmarkEnd w:id="136"/>
+    </w:p>
+    <w:p>
+      <w:pPr>
+        <w:pStyle w:val="FirstParagraph"/>
+      </w:pPr>
+      <w:r>
+        <w:rPr>
+          <w:b/>
+        </w:rPr>
+        <w:t xml:space="preserve">What it does:</w:t>
+      </w:r>
+      <w:r>
+        <w:t xml:space="preserve"> </w:t>
+      </w:r>
+      <w:r>
+        <w:t xml:space="preserve">Generate and export a report on the wellness of your team.</w:t>
+      </w:r>
+      <w:r>
+        <w:t xml:space="preserve"> </w:t>
+      </w:r>
+      <w:r>
+        <w:rPr>
+          <w:b/>
+        </w:rPr>
+        <w:t xml:space="preserve">How to get there:</w:t>
+      </w:r>
+      <w:r>
+        <w:t xml:space="preserve"> </w:t>
+      </w:r>
+      <w:r>
+        <w:t xml:space="preserve">Go to</w:t>
+      </w:r>
+      <w:r>
+        <w:t xml:space="preserve"> </w:t>
+      </w:r>
+      <w:r>
+        <w:rPr>
+          <w:rStyle w:val="VerbatimChar"/>
+        </w:rPr>
+        <w:t xml:space="preserve">/admin/wellness-report</w:t>
+      </w:r>
+    </w:p>
+    <w:p>
+      <w:pPr>
+        <w:pStyle w:val="Heading4"/>
+      </w:pPr>
+      <w:bookmarkStart w:id="137" w:name="remote-patient-monitoring-rpm-dashboard"/>
+      <w:r>
+        <w:t xml:space="preserve">Remote Patient Monitoring (RPM) Dashboard</w:t>
+      </w:r>
+      <w:bookmarkEnd w:id="137"/>
+    </w:p>
+    <w:p>
+      <w:pPr>
+        <w:pStyle w:val="FirstParagraph"/>
+      </w:pPr>
+      <w:r>
+        <w:rPr>
+          <w:b/>
+        </w:rPr>
+        <w:t xml:space="preserve">What it does:</w:t>
+      </w:r>
+      <w:r>
+        <w:t xml:space="preserve"> </w:t>
+      </w:r>
+      <w:r>
+        <w:t xml:space="preserve">Watch home health readings (like blood pressure and glucose) from patients and get alerts when something looks wrong.</w:t>
+      </w:r>
+      <w:r>
+        <w:t xml:space="preserve"> </w:t>
+      </w:r>
+      <w:r>
+        <w:rPr>
+          <w:b/>
+        </w:rPr>
+        <w:t xml:space="preserve">How to get there:</w:t>
+      </w:r>
+      <w:r>
+        <w:t xml:space="preserve"> </w:t>
+      </w:r>
+      <w:r>
+        <w:t xml:space="preserve">Go to</w:t>
+      </w:r>
+      <w:r>
+        <w:t xml:space="preserve"> </w:t>
+      </w:r>
+      <w:r>
+        <w:rPr>
+          <w:rStyle w:val="VerbatimChar"/>
+        </w:rPr>
+        <w:t xml:space="preserve">/rpm-dashboard</w:t>
+      </w:r>
+    </w:p>
+    <w:p>
+      <w:pPr>
+        <w:pStyle w:val="Heading4"/>
+      </w:pPr>
+      <w:bookmarkStart w:id="138" w:name="patient-avatar-1"/>
+      <w:r>
+        <w:t xml:space="preserve">Patient Avatar</w:t>
+      </w:r>
+      <w:bookmarkEnd w:id="138"/>
+    </w:p>
+    <w:p>
+      <w:pPr>
+        <w:pStyle w:val="FirstParagraph"/>
+      </w:pPr>
+      <w:r>
+        <w:rPr>
+          <w:b/>
+        </w:rPr>
+        <w:t xml:space="preserve">What it does:</w:t>
+      </w:r>
+      <w:r>
+        <w:t xml:space="preserve"> </w:t>
+      </w:r>
+      <w:r>
+        <w:t xml:space="preserve">A body-map picture of a patient that highlights their current health concerns at a glance.</w:t>
+      </w:r>
+      <w:r>
+        <w:t xml:space="preserve"> </w:t>
+      </w:r>
+      <w:r>
+        <w:rPr>
+          <w:b/>
+        </w:rPr>
+        <w:t xml:space="preserve">How to get there:</w:t>
+      </w:r>
+      <w:r>
+        <w:t xml:space="preserve"> </w:t>
+      </w:r>
+      <w:r>
+        <w:t xml:space="preserve">Go to</w:t>
+      </w:r>
+      <w:r>
+        <w:t xml:space="preserve"> </w:t>
+      </w:r>
+      <w:r>
+        <w:rPr>
+          <w:rStyle w:val="VerbatimChar"/>
+        </w:rPr>
+        <w:t xml:space="preserve">/patient-avatar/&lt;patient id&gt;</w:t>
+      </w:r>
+    </w:p>
+    <w:p>
+      <w:pPr>
+        <w:pStyle w:val="Heading4"/>
+      </w:pPr>
+      <w:bookmarkStart w:id="139" w:name="team-huddle"/>
+      <w:r>
+        <w:t xml:space="preserve">Team Huddle</w:t>
+      </w:r>
+      <w:bookmarkEnd w:id="139"/>
+    </w:p>
+    <w:p>
+      <w:pPr>
+        <w:pStyle w:val="FirstParagraph"/>
+      </w:pPr>
+      <w:r>
+        <w:rPr>
+          <w:b/>
+        </w:rPr>
+        <w:t xml:space="preserve">What it does:</w:t>
+      </w:r>
+      <w:r>
+        <w:t xml:space="preserve"> </w:t>
+      </w:r>
+      <w:r>
+        <w:t xml:space="preserve">A shared board for the daily team huddle and care-team communication.</w:t>
+      </w:r>
+      <w:r>
+        <w:t xml:space="preserve"> </w:t>
+      </w:r>
+      <w:r>
+        <w:rPr>
+          <w:b/>
+        </w:rPr>
+        <w:t xml:space="preserve">How to get there:</w:t>
+      </w:r>
+      <w:r>
+        <w:t xml:space="preserve"> </w:t>
+      </w:r>
+      <w:r>
+        <w:t xml:space="preserve">Go to</w:t>
+      </w:r>
+      <w:r>
+        <w:t xml:space="preserve"> </w:t>
+      </w:r>
+      <w:r>
+        <w:rPr>
+          <w:rStyle w:val="VerbatimChar"/>
+        </w:rPr>
+        <w:t xml:space="preserve">/team-huddle</w:t>
+      </w:r>
+    </w:p>
+    <w:p>
+      <w:pPr>
+        <w:pStyle w:val="Heading4"/>
+      </w:pPr>
+      <w:bookmarkStart w:id="140" w:name="receiving-dashboard"/>
+      <w:r>
+        <w:t xml:space="preserve">Receiving Dashboard</w:t>
+      </w:r>
+      <w:bookmarkEnd w:id="140"/>
+    </w:p>
+    <w:p>
+      <w:pPr>
+        <w:pStyle w:val="FirstParagraph"/>
+      </w:pPr>
+      <w:r>
+        <w:rPr>
+          <w:b/>
+        </w:rPr>
+        <w:t xml:space="preserve">What it does:</w:t>
+      </w:r>
+      <w:r>
+        <w:t xml:space="preserve"> </w:t>
+      </w:r>
+      <w:r>
+        <w:t xml:space="preserve">Intake screen for patients being transferred in from another facility.</w:t>
+      </w:r>
+      <w:r>
+        <w:t xml:space="preserve"> </w:t>
+      </w:r>
+      <w:r>
+        <w:rPr>
+          <w:b/>
+        </w:rPr>
+        <w:t xml:space="preserve">How to get there:</w:t>
+      </w:r>
+      <w:r>
+        <w:t xml:space="preserve"> </w:t>
+      </w:r>
+      <w:r>
+        <w:t xml:space="preserve">Go to</w:t>
+      </w:r>
+      <w:r>
+        <w:t xml:space="preserve"> </w:t>
+      </w:r>
+      <w:r>
+        <w:rPr>
+          <w:rStyle w:val="VerbatimChar"/>
+        </w:rPr>
+        <w:t xml:space="preserve">/handoff/receiving</w:t>
+      </w:r>
+    </w:p>
+    <w:p>
+      <w:pPr>
+        <w:pStyle w:val="Heading3"/>
+      </w:pPr>
+      <w:bookmarkStart w:id="141" w:name="for-doctors-and-providers-1"/>
+      <w:r>
+        <w:t xml:space="preserve">For Doctors and Providers</w:t>
+      </w:r>
+      <w:bookmarkEnd w:id="141"/>
+    </w:p>
+    <w:p>
+      <w:pPr>
+        <w:pStyle w:val="Heading4"/>
+      </w:pPr>
+      <w:bookmarkStart w:id="142" w:name="appointment-analytics"/>
+      <w:r>
+        <w:t xml:space="preserve">Appointment Analytics</w:t>
+      </w:r>
+      <w:bookmarkEnd w:id="142"/>
+    </w:p>
+    <w:p>
+      <w:pPr>
+        <w:pStyle w:val="FirstParagraph"/>
+      </w:pPr>
+      <w:r>
+        <w:rPr>
+          <w:b/>
+        </w:rPr>
+        <w:t xml:space="preserve">What it does:</w:t>
+      </w:r>
+      <w:r>
+        <w:t xml:space="preserve"> </w:t>
+      </w:r>
+      <w:r>
+        <w:t xml:space="preserve">See appointment usage, no-show rates, and scheduling trends.</w:t>
+      </w:r>
+      <w:r>
+        <w:t xml:space="preserve"> </w:t>
+      </w:r>
+      <w:r>
+        <w:rPr>
+          <w:b/>
+        </w:rPr>
+        <w:t xml:space="preserve">How to get there:</w:t>
+      </w:r>
+      <w:r>
+        <w:t xml:space="preserve"> </w:t>
+      </w:r>
+      <w:r>
+        <w:rPr>
+          <w:rStyle w:val="VerbatimChar"/>
+        </w:rPr>
+        <w:t xml:space="preserve">/appointment-analytics</w:t>
+      </w:r>
+    </w:p>
+    <w:p>
+      <w:pPr>
+        <w:pStyle w:val="Heading4"/>
+      </w:pPr>
+      <w:bookmarkStart w:id="143" w:name="specialist-dashboard-and-field-visits"/>
+      <w:r>
+        <w:t xml:space="preserve">Specialist Dashboard and Field Visits</w:t>
+      </w:r>
+      <w:bookmarkEnd w:id="143"/>
+    </w:p>
+    <w:p>
+      <w:pPr>
+        <w:pStyle w:val="FirstParagraph"/>
+      </w:pPr>
+      <w:r>
+        <w:rPr>
+          <w:b/>
+        </w:rPr>
+        <w:t xml:space="preserve">What it does:</w:t>
+      </w:r>
+      <w:r>
+        <w:t xml:space="preserve"> </w:t>
+      </w:r>
+      <w:r>
+        <w:t xml:space="preserve">A specialty-specific dashboard, plus a workflow for documenting field/home visits.</w:t>
+      </w:r>
+      <w:r>
+        <w:t xml:space="preserve"> </w:t>
+      </w:r>
+      <w:r>
+        <w:rPr>
+          <w:b/>
+        </w:rPr>
+        <w:t xml:space="preserve">How to get there:</w:t>
+      </w:r>
+      <w:r>
+        <w:t xml:space="preserve"> </w:t>
+      </w:r>
+      <w:r>
+        <w:rPr>
+          <w:rStyle w:val="VerbatimChar"/>
+        </w:rPr>
+        <w:t xml:space="preserve">/specialist/dashboard/&lt;type&gt;</w:t>
+      </w:r>
+      <w:r>
+        <w:t xml:space="preserve"> </w:t>
+      </w:r>
+      <w:r>
+        <w:t xml:space="preserve">and</w:t>
+      </w:r>
+      <w:r>
+        <w:t xml:space="preserve"> </w:t>
+      </w:r>
+      <w:r>
+        <w:rPr>
+          <w:rStyle w:val="VerbatimChar"/>
+        </w:rPr>
+        <w:t xml:space="preserve">/specialist/visit/&lt;visit id&gt;</w:t>
+      </w:r>
+    </w:p>
+    <w:p>
+      <w:pPr>
+        <w:pStyle w:val="Heading4"/>
+      </w:pPr>
+      <w:bookmarkStart w:id="144" w:name="provider-availability"/>
+      <w:r>
+        <w:t xml:space="preserve">Provider Availability</w:t>
+      </w:r>
+      <w:bookmarkEnd w:id="144"/>
+    </w:p>
+    <w:p>
+      <w:pPr>
+        <w:pStyle w:val="FirstParagraph"/>
+      </w:pPr>
+      <w:r>
+        <w:rPr>
+          <w:b/>
+        </w:rPr>
+        <w:t xml:space="preserve">What it does:</w:t>
+      </w:r>
+      <w:r>
+        <w:t xml:space="preserve"> </w:t>
+      </w:r>
+      <w:r>
+        <w:t xml:space="preserve">Set and edit your own availability and schedule.</w:t>
+      </w:r>
+      <w:r>
+        <w:t xml:space="preserve"> </w:t>
+      </w:r>
+      <w:r>
+        <w:rPr>
+          <w:b/>
+        </w:rPr>
+        <w:t xml:space="preserve">How to get there:</w:t>
+      </w:r>
+      <w:r>
+        <w:t xml:space="preserve"> </w:t>
+      </w:r>
+      <w:r>
+        <w:rPr>
+          <w:rStyle w:val="VerbatimChar"/>
+        </w:rPr>
+        <w:t xml:space="preserve">/provider/availability</w:t>
+      </w:r>
+    </w:p>
+    <w:p>
+      <w:pPr>
+        <w:pStyle w:val="Heading4"/>
+      </w:pPr>
+      <w:bookmarkStart w:id="145" w:name="questionnaire-analytics"/>
+      <w:r>
+        <w:t xml:space="preserve">Questionnaire Analytics</w:t>
+      </w:r>
+      <w:bookmarkEnd w:id="145"/>
+    </w:p>
+    <w:p>
+      <w:pPr>
+        <w:pStyle w:val="FirstParagraph"/>
+      </w:pPr>
+      <w:r>
+        <w:rPr>
+          <w:b/>
+        </w:rPr>
+        <w:t xml:space="preserve">What it does:</w:t>
+      </w:r>
+      <w:r>
+        <w:t xml:space="preserve"> </w:t>
+      </w:r>
+      <w:r>
+        <w:t xml:space="preserve">Review patient-reported questionnaire results and outcomes.</w:t>
+      </w:r>
+      <w:r>
+        <w:t xml:space="preserve"> </w:t>
+      </w:r>
+      <w:r>
+        <w:rPr>
+          <w:b/>
+        </w:rPr>
+        <w:t xml:space="preserve">How to get there:</w:t>
+      </w:r>
+      <w:r>
+        <w:t xml:space="preserve"> </w:t>
+      </w:r>
+      <w:r>
+        <w:rPr>
+          <w:rStyle w:val="VerbatimChar"/>
+        </w:rPr>
+        <w:t xml:space="preserve">/questionnaire-analytics</w:t>
+      </w:r>
+    </w:p>
+    <w:p>
+      <w:pPr>
+        <w:pStyle w:val="Heading4"/>
+      </w:pPr>
+      <w:bookmarkStart w:id="146" w:name="healthcare-integrations"/>
+      <w:r>
+        <w:t xml:space="preserve">Healthcare Integrations</w:t>
+      </w:r>
+      <w:bookmarkEnd w:id="146"/>
+    </w:p>
+    <w:p>
+      <w:pPr>
+        <w:pStyle w:val="FirstParagraph"/>
+      </w:pPr>
+      <w:r>
+        <w:rPr>
+          <w:b/>
+        </w:rPr>
+        <w:t xml:space="preserve">What it does:</w:t>
+      </w:r>
+      <w:r>
+        <w:t xml:space="preserve"> </w:t>
+      </w:r>
+      <w:r>
+        <w:t xml:space="preserve">Manage connections to outside healthcare systems (EHRs).</w:t>
+      </w:r>
+      <w:r>
+        <w:t xml:space="preserve"> </w:t>
+      </w:r>
+      <w:r>
+        <w:rPr>
+          <w:b/>
+        </w:rPr>
+        <w:t xml:space="preserve">How to get there:</w:t>
+      </w:r>
+      <w:r>
+        <w:t xml:space="preserve"> </w:t>
+      </w:r>
+      <w:r>
+        <w:rPr>
+          <w:rStyle w:val="VerbatimChar"/>
+        </w:rPr>
+        <w:t xml:space="preserve">/healthcare-integrations</w:t>
+      </w:r>
+    </w:p>
+    <w:p>
+      <w:pPr>
+        <w:pStyle w:val="Heading4"/>
+      </w:pPr>
+      <w:bookmarkStart w:id="147" w:name="care-operations"/>
+      <w:r>
+        <w:t xml:space="preserve">Care Operations</w:t>
+      </w:r>
+      <w:bookmarkEnd w:id="147"/>
+    </w:p>
+    <w:p>
+      <w:pPr>
+        <w:pStyle w:val="FirstParagraph"/>
+      </w:pPr>
+      <w:r>
+        <w:rPr>
+          <w:b/>
+        </w:rPr>
+        <w:t xml:space="preserve">What it does:</w:t>
+      </w:r>
+      <w:r>
+        <w:t xml:space="preserve"> </w:t>
+      </w:r>
+      <w:r>
+        <w:t xml:space="preserve">Oversee provider workflows and day-to-day care operations.</w:t>
+      </w:r>
+      <w:r>
+        <w:t xml:space="preserve"> </w:t>
+      </w:r>
+      <w:r>
+        <w:rPr>
+          <w:b/>
+        </w:rPr>
+        <w:t xml:space="preserve">How to get there:</w:t>
+      </w:r>
+      <w:r>
+        <w:t xml:space="preserve"> </w:t>
+      </w:r>
+      <w:r>
+        <w:rPr>
+          <w:rStyle w:val="VerbatimChar"/>
+        </w:rPr>
+        <w:t xml:space="preserve">/care-operations</w:t>
+      </w:r>
+    </w:p>
+    <w:p>
+      <w:pPr>
+        <w:pStyle w:val="Heading3"/>
+      </w:pPr>
+      <w:bookmarkStart w:id="148" w:name="for-administrators-1"/>
+      <w:r>
+        <w:t xml:space="preserve">For Administrators</w:t>
+      </w:r>
+      <w:bookmarkEnd w:id="148"/>
+    </w:p>
+    <w:p>
+      <w:pPr>
+        <w:pStyle w:val="Heading4"/>
+      </w:pPr>
+      <w:bookmarkStart w:id="149" w:name="dashboard-hub"/>
+      <w:r>
+        <w:t xml:space="preserve">Dashboard Hub</w:t>
+      </w:r>
+      <w:bookmarkEnd w:id="149"/>
+    </w:p>
+    <w:p>
+      <w:pPr>
+        <w:pStyle w:val="FirstParagraph"/>
+      </w:pPr>
+      <w:r>
+        <w:rPr>
+          <w:b/>
+        </w:rPr>
+        <w:t xml:space="preserve">What it does:</w:t>
+      </w:r>
+      <w:r>
+        <w:t xml:space="preserve"> </w:t>
+      </w:r>
+      <w:r>
+        <w:t xml:space="preserve">The central gateway with links to every administrative dashboard.</w:t>
+      </w:r>
+      <w:r>
+        <w:t xml:space="preserve"> </w:t>
+      </w:r>
+      <w:r>
+        <w:rPr>
+          <w:b/>
+        </w:rPr>
+        <w:t xml:space="preserve">How to get there:</w:t>
+      </w:r>
+      <w:r>
+        <w:t xml:space="preserve"> </w:t>
+      </w:r>
+      <w:r>
+        <w:rPr>
+          <w:rStyle w:val="VerbatimChar"/>
+        </w:rPr>
+        <w:t xml:space="preserve">/hub</w:t>
+      </w:r>
+    </w:p>
+    <w:p>
+      <w:pPr>
+        <w:pStyle w:val="Heading4"/>
+      </w:pPr>
+      <w:bookmarkStart w:id="150" w:name="admin-profile-editor"/>
+      <w:r>
+        <w:t xml:space="preserve">Admin Profile Editor</w:t>
+      </w:r>
+      <w:bookmarkEnd w:id="150"/>
+    </w:p>
+    <w:p>
+      <w:pPr>
+        <w:pStyle w:val="FirstParagraph"/>
+      </w:pPr>
+      <w:r>
+        <w:rPr>
+          <w:b/>
+        </w:rPr>
+        <w:t xml:space="preserve">What it does:</w:t>
+      </w:r>
+      <w:r>
+        <w:t xml:space="preserve"> </w:t>
+      </w:r>
+      <w:r>
+        <w:t xml:space="preserve">Edit organization and staff profile information.</w:t>
+      </w:r>
+      <w:r>
+        <w:t xml:space="preserve"> </w:t>
+      </w:r>
+      <w:r>
+        <w:rPr>
+          <w:b/>
+        </w:rPr>
+        <w:t xml:space="preserve">How to get there:</w:t>
+      </w:r>
+      <w:r>
+        <w:t xml:space="preserve"> </w:t>
+      </w:r>
+      <w:r>
+        <w:rPr>
+          <w:rStyle w:val="VerbatimChar"/>
+        </w:rPr>
+        <w:t xml:space="preserve">/admin-profile-editor</w:t>
+      </w:r>
+    </w:p>
+    <w:p>
+      <w:pPr>
+        <w:pStyle w:val="Heading4"/>
+      </w:pPr>
+      <w:bookmarkStart w:id="151" w:name="admin-questions"/>
+      <w:r>
+        <w:t xml:space="preserve">Admin Questions</w:t>
+      </w:r>
+      <w:bookmarkEnd w:id="151"/>
+    </w:p>
+    <w:p>
+      <w:pPr>
+        <w:pStyle w:val="FirstParagraph"/>
+      </w:pPr>
+      <w:r>
+        <w:rPr>
+          <w:b/>
+        </w:rPr>
+        <w:t xml:space="preserve">What it does:</w:t>
+      </w:r>
+      <w:r>
+        <w:t xml:space="preserve"> </w:t>
+      </w:r>
+      <w:r>
+        <w:t xml:space="preserve">Manage the library of health questions patients can be asked.</w:t>
+      </w:r>
+      <w:r>
+        <w:t xml:space="preserve"> </w:t>
+      </w:r>
+      <w:r>
+        <w:rPr>
+          <w:b/>
+        </w:rPr>
+        <w:t xml:space="preserve">How to get there:</w:t>
+      </w:r>
+      <w:r>
+        <w:t xml:space="preserve"> </w:t>
+      </w:r>
+      <w:r>
+        <w:rPr>
+          <w:rStyle w:val="VerbatimChar"/>
+        </w:rPr>
+        <w:t xml:space="preserve">/admin-questions</w:t>
+      </w:r>
+    </w:p>
+    <w:p>
+      <w:pPr>
+        <w:pStyle w:val="Heading4"/>
+      </w:pPr>
+      <w:bookmarkStart w:id="152" w:name="billing-suite"/>
+      <w:r>
+        <w:t xml:space="preserve">Billing Suite</w:t>
+      </w:r>
+      <w:bookmarkEnd w:id="152"/>
+    </w:p>
+    <w:p>
+      <w:pPr>
+        <w:pStyle w:val="FirstParagraph"/>
+      </w:pPr>
+      <w:r>
+        <w:rPr>
+          <w:b/>
+        </w:rPr>
+        <w:t xml:space="preserve">What it does:</w:t>
+      </w:r>
+      <w:r>
+        <w:t xml:space="preserve"> </w:t>
+      </w:r>
+      <w:r>
+        <w:t xml:space="preserve">The revenue-cycle hub – claims, appeals, prior authorization, eligibility, and payment posting in one place.</w:t>
+      </w:r>
+      <w:r>
+        <w:t xml:space="preserve"> </w:t>
+      </w:r>
+      <w:r>
+        <w:rPr>
+          <w:b/>
+        </w:rPr>
+        <w:t xml:space="preserve">How to get there:</w:t>
+      </w:r>
+      <w:r>
+        <w:t xml:space="preserve"> </w:t>
+      </w:r>
+      <w:r>
+        <w:rPr>
+          <w:rStyle w:val="VerbatimChar"/>
+        </w:rPr>
+        <w:t xml:space="preserve">/billing-suite</w:t>
+      </w:r>
+    </w:p>
+    <w:p>
+      <w:pPr>
+        <w:pStyle w:val="Heading4"/>
+      </w:pPr>
+      <w:bookmarkStart w:id="153" w:name="api-key-manager"/>
+      <w:r>
+        <w:t xml:space="preserve">API Key Manager</w:t>
+      </w:r>
+      <w:bookmarkEnd w:id="153"/>
+    </w:p>
+    <w:p>
+      <w:pPr>
+        <w:pStyle w:val="FirstParagraph"/>
+      </w:pPr>
+      <w:r>
+        <w:rPr>
+          <w:b/>
+        </w:rPr>
+        <w:t xml:space="preserve">What it does:</w:t>
+      </w:r>
+      <w:r>
+        <w:t xml:space="preserve"> </w:t>
+      </w:r>
+      <w:r>
+        <w:t xml:space="preserve">Create and manage keys for system integrations.</w:t>
+      </w:r>
+      <w:r>
+        <w:t xml:space="preserve"> </w:t>
+      </w:r>
+      <w:r>
+        <w:rPr>
+          <w:b/>
+        </w:rPr>
+        <w:t xml:space="preserve">How to get there:</w:t>
+      </w:r>
+      <w:r>
+        <w:t xml:space="preserve"> </w:t>
+      </w:r>
+      <w:r>
+        <w:rPr>
+          <w:rStyle w:val="VerbatimChar"/>
+        </w:rPr>
+        <w:t xml:space="preserve">/admin/api-keys</w:t>
+      </w:r>
+    </w:p>
+    <w:p>
+      <w:pPr>
+        <w:pStyle w:val="Heading4"/>
+      </w:pPr>
+      <w:bookmarkStart w:id="154" w:name="security-and-compliance-1"/>
+      <w:r>
+        <w:t xml:space="preserve">Security and Compliance</w:t>
+      </w:r>
+      <w:bookmarkEnd w:id="154"/>
+    </w:p>
+    <w:p>
+      <w:pPr>
+        <w:pStyle w:val="FirstParagraph"/>
+      </w:pPr>
+      <w:r>
+        <w:rPr>
+          <w:b/>
+        </w:rPr>
+        <w:t xml:space="preserve">What it does:</w:t>
+      </w:r>
+      <w:r>
+        <w:t xml:space="preserve"> </w:t>
+      </w:r>
+      <w:r>
+        <w:t xml:space="preserve">Monitor HIPAA and SOC 2 compliance status for your organization.</w:t>
+      </w:r>
+      <w:r>
+        <w:t xml:space="preserve"> </w:t>
+      </w:r>
+      <w:r>
+        <w:rPr>
+          <w:b/>
+        </w:rPr>
+        <w:t xml:space="preserve">How to get there:</w:t>
+      </w:r>
+      <w:r>
+        <w:t xml:space="preserve"> </w:t>
+      </w:r>
+      <w:r>
+        <w:rPr>
+          <w:rStyle w:val="VerbatimChar"/>
+        </w:rPr>
+        <w:t xml:space="preserve">/security-compliance</w:t>
+      </w:r>
+    </w:p>
+    <w:p>
+      <w:pPr>
+        <w:pStyle w:val="Heading4"/>
+      </w:pPr>
+      <w:bookmarkStart w:id="155" w:name="interoperability-dashboard"/>
+      <w:r>
+        <w:t xml:space="preserve">Interoperability Dashboard</w:t>
+      </w:r>
+      <w:bookmarkEnd w:id="155"/>
+    </w:p>
+    <w:p>
+      <w:pPr>
+        <w:pStyle w:val="FirstParagraph"/>
+      </w:pPr>
+      <w:r>
+        <w:rPr>
+          <w:b/>
+        </w:rPr>
+        <w:t xml:space="preserve">What it does:</w:t>
+      </w:r>
+      <w:r>
+        <w:t xml:space="preserve"> </w:t>
+      </w:r>
+      <w:r>
+        <w:t xml:space="preserve">Manage FHIR, HL7, and data-mapping between systems.</w:t>
+      </w:r>
+      <w:r>
+        <w:t xml:space="preserve"> </w:t>
+      </w:r>
+      <w:r>
+        <w:rPr>
+          <w:b/>
+        </w:rPr>
+        <w:t xml:space="preserve">How to get there:</w:t>
+      </w:r>
+      <w:r>
+        <w:t xml:space="preserve"> </w:t>
+      </w:r>
+      <w:r>
+        <w:rPr>
+          <w:rStyle w:val="VerbatimChar"/>
+        </w:rPr>
+        <w:t xml:space="preserve">/interoperability</w:t>
+      </w:r>
+    </w:p>
+    <w:p>
+      <w:pPr>
+        <w:pStyle w:val="Heading4"/>
+      </w:pPr>
+      <w:bookmarkStart w:id="156" w:name="system-admin-suite"/>
+      <w:r>
+        <w:t xml:space="preserve">System Admin Suite</w:t>
+      </w:r>
+      <w:bookmarkEnd w:id="156"/>
+    </w:p>
+    <w:p>
+      <w:pPr>
+        <w:pStyle w:val="FirstParagraph"/>
+      </w:pPr>
+      <w:r>
+        <w:rPr>
+          <w:b/>
+        </w:rPr>
+        <w:t xml:space="preserve">What it does:</w:t>
+      </w:r>
+      <w:r>
+        <w:t xml:space="preserve"> </w:t>
+      </w:r>
+      <w:r>
+        <w:t xml:space="preserve">Manage users, roles, facilities, modules, and clearinghouse settings.</w:t>
+      </w:r>
+      <w:r>
+        <w:t xml:space="preserve"> </w:t>
+      </w:r>
+      <w:r>
+        <w:rPr>
+          <w:b/>
+        </w:rPr>
+        <w:t xml:space="preserve">How to get there:</w:t>
+      </w:r>
+      <w:r>
+        <w:t xml:space="preserve"> </w:t>
+      </w:r>
+      <w:r>
+        <w:rPr>
+          <w:rStyle w:val="VerbatimChar"/>
+        </w:rPr>
+        <w:t xml:space="preserve">/system-admin</w:t>
+      </w:r>
+    </w:p>
+    <w:p>
+      <w:pPr>
+        <w:pStyle w:val="Heading4"/>
+      </w:pPr>
+      <w:bookmarkStart w:id="157" w:name="clinical-quality-dashboard"/>
+      <w:r>
+        <w:t xml:space="preserve">Clinical Quality Dashboard</w:t>
+      </w:r>
+      <w:bookmarkEnd w:id="157"/>
+    </w:p>
+    <w:p>
+      <w:pPr>
+        <w:pStyle w:val="FirstParagraph"/>
+      </w:pPr>
+      <w:r>
+        <w:rPr>
+          <w:b/>
+        </w:rPr>
+        <w:t xml:space="preserve">What it does:</w:t>
+      </w:r>
+      <w:r>
+        <w:t xml:space="preserve"> </w:t>
+      </w:r>
+      <w:r>
+        <w:t xml:space="preserve">Track quality measures and public-health reporting.</w:t>
+      </w:r>
+      <w:r>
+        <w:t xml:space="preserve"> </w:t>
+      </w:r>
+      <w:r>
+        <w:rPr>
+          <w:b/>
+        </w:rPr>
+        <w:t xml:space="preserve">How to get there:</w:t>
+      </w:r>
+      <w:r>
+        <w:t xml:space="preserve"> </w:t>
+      </w:r>
+      <w:r>
+        <w:rPr>
+          <w:rStyle w:val="VerbatimChar"/>
+        </w:rPr>
+        <w:t xml:space="preserve">/clinical-quality</w:t>
+      </w:r>
+    </w:p>
+    <w:p>
+      <w:pPr>
+        <w:pStyle w:val="Heading4"/>
+      </w:pPr>
+      <w:bookmarkStart w:id="158" w:name="admin-tools-dashboard"/>
+      <w:r>
+        <w:t xml:space="preserve">Admin Tools Dashboard</w:t>
+      </w:r>
+      <w:bookmarkEnd w:id="158"/>
+    </w:p>
+    <w:p>
+      <w:pPr>
+        <w:pStyle w:val="FirstParagraph"/>
+      </w:pPr>
+      <w:r>
+        <w:rPr>
+          <w:b/>
+        </w:rPr>
+        <w:t xml:space="preserve">What it does:</w:t>
+      </w:r>
+      <w:r>
+        <w:t xml:space="preserve"> </w:t>
+      </w:r>
+      <w:r>
+        <w:t xml:space="preserve">Engagement, enrollment, export, and alert tools in one place.</w:t>
+      </w:r>
+      <w:r>
+        <w:t xml:space="preserve"> </w:t>
+      </w:r>
+      <w:r>
+        <w:rPr>
+          <w:b/>
+        </w:rPr>
+        <w:t xml:space="preserve">How to get there:</w:t>
+      </w:r>
+      <w:r>
+        <w:t xml:space="preserve"> </w:t>
+      </w:r>
+      <w:r>
+        <w:rPr>
+          <w:rStyle w:val="VerbatimChar"/>
+        </w:rPr>
+        <w:t xml:space="preserve">/admin-tools</w:t>
+      </w:r>
+    </w:p>
+    <w:p>
+      <w:pPr>
+        <w:pStyle w:val="Heading3"/>
+      </w:pPr>
+      <w:bookmarkStart w:id="159" w:name="for-super-administrators-1"/>
+      <w:r>
+        <w:t xml:space="preserve">For Super Administrators</w:t>
+      </w:r>
+      <w:bookmarkEnd w:id="159"/>
+    </w:p>
+    <w:p>
+      <w:pPr>
+        <w:pStyle w:val="Heading4"/>
+      </w:pPr>
+      <w:bookmarkStart w:id="160" w:name="mcp-management"/>
+      <w:r>
+        <w:t xml:space="preserve">MCP Management</w:t>
+      </w:r>
+      <w:bookmarkEnd w:id="160"/>
+    </w:p>
+    <w:p>
+      <w:pPr>
+        <w:pStyle w:val="FirstParagraph"/>
+      </w:pPr>
+      <w:r>
+        <w:rPr>
+          <w:b/>
+        </w:rPr>
+        <w:t xml:space="preserve">What it does:</w:t>
+      </w:r>
+      <w:r>
+        <w:t xml:space="preserve"> </w:t>
+      </w:r>
+      <w:r>
+        <w:t xml:space="preserve">Manage the platform’s AI tool servers – health, API keys, workflow chains, and costs.</w:t>
+      </w:r>
+      <w:r>
+        <w:t xml:space="preserve"> </w:t>
+      </w:r>
+      <w:r>
+        <w:rPr>
+          <w:b/>
+        </w:rPr>
+        <w:t xml:space="preserve">How to get there:</w:t>
+      </w:r>
+      <w:r>
+        <w:t xml:space="preserve"> </w:t>
+      </w:r>
+      <w:r>
+        <w:rPr>
+          <w:rStyle w:val="VerbatimChar"/>
+        </w:rPr>
+        <w:t xml:space="preserve">/mcp-management</w:t>
+      </w:r>
+    </w:p>
+    <w:p>
+      <w:pPr>
+        <w:pStyle w:val="Heading4"/>
+      </w:pPr>
+      <w:bookmarkStart w:id="161" w:name="behavioral-anomaly-panel"/>
+      <w:r>
+        <w:t xml:space="preserve">Behavioral Anomaly Panel</w:t>
+      </w:r>
+      <w:bookmarkEnd w:id="161"/>
+    </w:p>
+    <w:p>
+      <w:pPr>
+        <w:pStyle w:val="FirstParagraph"/>
+      </w:pPr>
+      <w:r>
+        <w:rPr>
+          <w:b/>
+        </w:rPr>
+        <w:t xml:space="preserve">What it does:</w:t>
+      </w:r>
+      <w:r>
+        <w:t xml:space="preserve"> </w:t>
+      </w:r>
+      <w:r>
+        <w:t xml:space="preserve">Review unusual activity the Guardian Agent has detected.</w:t>
+      </w:r>
+      <w:r>
+        <w:t xml:space="preserve"> </w:t>
+      </w:r>
+      <w:r>
+        <w:rPr>
+          <w:b/>
+        </w:rPr>
+        <w:t xml:space="preserve">How to get there:</w:t>
+      </w:r>
+      <w:r>
+        <w:t xml:space="preserve"> </w:t>
+      </w:r>
+      <w:r>
+        <w:rPr>
+          <w:rStyle w:val="VerbatimChar"/>
+        </w:rPr>
+        <w:t xml:space="preserve">/guardian/anomalies</w:t>
+      </w:r>
+    </w:p>
+    <w:p>
+      <w:pPr>
+        <w:pStyle w:val="Heading3"/>
+      </w:pPr>
+      <w:bookmarkStart w:id="162" w:name="ems-and-special-programs"/>
+      <w:r>
+        <w:t xml:space="preserve">EMS and Special Programs</w:t>
+      </w:r>
+      <w:bookmarkEnd w:id="162"/>
+    </w:p>
+    <w:p>
+      <w:pPr>
+        <w:pStyle w:val="Heading4"/>
+      </w:pPr>
+      <w:bookmarkStart w:id="163" w:name="ems-coordinated-response"/>
+      <w:r>
+        <w:t xml:space="preserve">EMS Coordinated Response</w:t>
+      </w:r>
+      <w:bookmarkEnd w:id="163"/>
+    </w:p>
+    <w:p>
+      <w:pPr>
+        <w:pStyle w:val="FirstParagraph"/>
+      </w:pPr>
+      <w:r>
+        <w:rPr>
+          <w:b/>
+        </w:rPr>
+        <w:t xml:space="preserve">What it does:</w:t>
+      </w:r>
+      <w:r>
+        <w:t xml:space="preserve"> </w:t>
+      </w:r>
+      <w:r>
+        <w:t xml:space="preserve">Coordinate an emergency response between EMS crews and the clinical team.</w:t>
+      </w:r>
+      <w:r>
+        <w:t xml:space="preserve"> </w:t>
+      </w:r>
+      <w:r>
+        <w:rPr>
+          <w:b/>
+        </w:rPr>
+        <w:t xml:space="preserve">How to get there:</w:t>
+      </w:r>
+      <w:r>
+        <w:t xml:space="preserve"> </w:t>
+      </w:r>
+      <w:r>
+        <w:rPr>
+          <w:rStyle w:val="VerbatimChar"/>
+        </w:rPr>
+        <w:t xml:space="preserve">/ems/coordinated-response/&lt;handoff id&gt;</w:t>
+      </w:r>
+    </w:p>
+    <w:p>
+      <w:pPr>
+        <w:pStyle w:val="Heading4"/>
+      </w:pPr>
+      <w:bookmarkStart w:id="164" w:name="law-enforcement-program"/>
+      <w:r>
+        <w:t xml:space="preserve">Law Enforcement Program</w:t>
+      </w:r>
+      <w:bookmarkEnd w:id="164"/>
+    </w:p>
+    <w:p>
+      <w:pPr>
+        <w:pStyle w:val="FirstParagraph"/>
+      </w:pPr>
+      <w:r>
+        <w:rPr>
+          <w:b/>
+        </w:rPr>
+        <w:t xml:space="preserve">What it does:</w:t>
+      </w:r>
+      <w:r>
+        <w:t xml:space="preserve"> </w:t>
+      </w:r>
+      <w:r>
+        <w:t xml:space="preserve">A landing page and dispatch coordination view for law-enforcement partner programs.</w:t>
+      </w:r>
+      <w:r>
+        <w:t xml:space="preserve"> </w:t>
+      </w:r>
+      <w:r>
+        <w:rPr>
+          <w:b/>
+        </w:rPr>
+        <w:t xml:space="preserve">How to get there:</w:t>
+      </w:r>
+      <w:r>
+        <w:t xml:space="preserve"> </w:t>
+      </w:r>
+      <w:r>
+        <w:rPr>
+          <w:rStyle w:val="VerbatimChar"/>
+        </w:rPr>
+        <w:t xml:space="preserve">/law-enforcement</w:t>
+      </w:r>
+      <w:r>
+        <w:t xml:space="preserve"> </w:t>
+      </w:r>
+      <w:r>
+        <w:t xml:space="preserve">and</w:t>
+      </w:r>
+      <w:r>
+        <w:t xml:space="preserve"> </w:t>
+      </w:r>
+      <w:r>
+        <w:rPr>
+          <w:rStyle w:val="VerbatimChar"/>
+        </w:rPr>
+        <w:t xml:space="preserve">/constable-dispatch</w:t>
+      </w:r>
+    </w:p>
+    <w:p>
+      <w:pPr>
+        <w:pStyle w:val="BodyText"/>
+      </w:pPr>
+      <w:r>
+        <w:rPr>
+          <w:i/>
+        </w:rPr>
+        <w:t xml:space="preserve">Addendum generated 2026-06-11 from a full review of the app’s screens. Covers 41 features that were missing from the earlier manual.</w:t>
       </w:r>
     </w:p>
     <w:sectPr/>

</xml_diff>